<commit_message>
Replace updated project documentation
</commit_message>
<xml_diff>
--- a/06 Documentation/Multi-Store Retail Performance - Project Documentation.docx
+++ b/06 Documentation/Multi-Store Retail Performance - Project Documentation.docx
@@ -1104,10 +1104,10 @@
         </w:rPr>
         <w:lastRenderedPageBreak/>
         <w:drawing>
-          <wp:inline distT="0" distB="0" distL="0" distR="0" wp14:anchorId="5A5C398F" wp14:editId="196DB853">
-            <wp:extent cx="5943600" cy="3329305"/>
-            <wp:effectExtent l="0" t="0" r="0" b="4445"/>
-            <wp:docPr id="705731147" name="Picture 1"/>
+          <wp:inline distT="0" distB="0" distL="0" distR="0" wp14:anchorId="5788D4F4" wp14:editId="47322BD9">
+            <wp:extent cx="5943600" cy="3334385"/>
+            <wp:effectExtent l="0" t="0" r="0" b="0"/>
+            <wp:docPr id="1173718023" name="Picture 3"/>
             <wp:cNvGraphicFramePr>
               <a:graphicFrameLocks xmlns:a="http://schemas.openxmlformats.org/drawingml/2006/main" noChangeAspect="1"/>
             </wp:cNvGraphicFramePr>
@@ -1115,7 +1115,7 @@
               <a:graphicData uri="http://schemas.openxmlformats.org/drawingml/2006/picture">
                 <pic:pic xmlns:pic="http://schemas.openxmlformats.org/drawingml/2006/picture">
                   <pic:nvPicPr>
-                    <pic:cNvPr id="705731147" name="Picture 705731147"/>
+                    <pic:cNvPr id="1173718023" name="Picture 1173718023"/>
                     <pic:cNvPicPr/>
                   </pic:nvPicPr>
                   <pic:blipFill>
@@ -1133,7 +1133,7 @@
                   <pic:spPr>
                     <a:xfrm>
                       <a:off x="0" y="0"/>
-                      <a:ext cx="5943600" cy="3329305"/>
+                      <a:ext cx="5943600" cy="3334385"/>
                     </a:xfrm>
                     <a:prstGeom prst="rect">
                       <a:avLst/>
@@ -1204,10 +1204,10 @@
         </w:rPr>
         <w:lastRenderedPageBreak/>
         <w:drawing>
-          <wp:inline distT="0" distB="0" distL="0" distR="0" wp14:anchorId="2CF2C803" wp14:editId="535C1646">
-            <wp:extent cx="5943600" cy="3333115"/>
-            <wp:effectExtent l="0" t="0" r="0" b="635"/>
-            <wp:docPr id="1958420676" name="Picture 2"/>
+          <wp:inline distT="0" distB="0" distL="0" distR="0" wp14:anchorId="42A77BFA" wp14:editId="1C5681F1">
+            <wp:extent cx="5943600" cy="3334385"/>
+            <wp:effectExtent l="0" t="0" r="0" b="0"/>
+            <wp:docPr id="1935769266" name="Picture 4"/>
             <wp:cNvGraphicFramePr>
               <a:graphicFrameLocks xmlns:a="http://schemas.openxmlformats.org/drawingml/2006/main" noChangeAspect="1"/>
             </wp:cNvGraphicFramePr>
@@ -1215,7 +1215,7 @@
               <a:graphicData uri="http://schemas.openxmlformats.org/drawingml/2006/picture">
                 <pic:pic xmlns:pic="http://schemas.openxmlformats.org/drawingml/2006/picture">
                   <pic:nvPicPr>
-                    <pic:cNvPr id="1958420676" name="Picture 1958420676"/>
+                    <pic:cNvPr id="1935769266" name="Picture 1935769266"/>
                     <pic:cNvPicPr/>
                   </pic:nvPicPr>
                   <pic:blipFill>
@@ -1233,7 +1233,7 @@
                   <pic:spPr>
                     <a:xfrm>
                       <a:off x="0" y="0"/>
-                      <a:ext cx="5943600" cy="3333115"/>
+                      <a:ext cx="5943600" cy="3334385"/>
                     </a:xfrm>
                     <a:prstGeom prst="rect">
                       <a:avLst/>

</xml_diff>